<commit_message>
AgroDiagnóstico: portal de casos agronómicos para ingenieros agrónomos de México
- Casos de campo, apoyo diagnóstico por similitud, fichas de 50 problemas fitosanitarios y directorio de 64 recursos.
- CRM de parcelas, visitas, recomendaciones, insumos y ventas; panel editorial y verificación de cédula.
- PDF/DOCX, kit documental, datos abiertos, glosario y glosario de datos.
- PHP 8 + PostgreSQL/Neon, sin Composer; CI con PostgreSQL y pruebas de humo.
- 7 casos y 7 cuentas demo, con datos de CRM de ejemplo.
- Microservicio FastAPI opcional para clasificación de riesgo fitosanitario.
</commit_message>
<xml_diff>
--- a/public/descargas/consentimiento-informado.docx
+++ b/public/descargas/consentimiento-informado.docx
@@ -4,274 +4,516 @@
   <w:body>
     <w:p>
       <w:pPr>
-        <w:pStyle w:val="Title"/>
+        <w:spacing w:before="0" w:after="20"/>
       </w:pPr>
       <w:r>
-        <w:t>Consentimiento informado para publicación de caso clínico</w:t>
+        <w:rPr>
+          <w:rFonts w:ascii="Calibri" w:hAnsi="Calibri"/>
+          <w:b/>
+          <w:color w:val="4F6F52"/>
+          <w:spacing w:val="24"/>
+          <w:sz w:val="15"/>
+        </w:rPr>
+        <w:t>FORMATO IMPRIMIBLE · FIRMA DEL PRODUCTOR</w:t>
       </w:r>
     </w:p>
     <w:p>
       <w:pPr>
-        <w:spacing w:after="280"/>
+        <w:pStyle w:val="Title"/>
+        <w:pBdr>
+          <w:bottom w:val="single" w:sz="8" w:space="2" w:color="4F6F52"/>
+        </w:pBdr>
+        <w:spacing w:before="0" w:after="60"/>
+      </w:pPr>
+      <w:r>
+        <w:t>Consentimiento informado del productor</w:t>
+      </w:r>
+    </w:p>
+    <w:p>
+      <w:pPr>
+        <w:spacing w:after="160"/>
       </w:pPr>
       <w:r>
         <w:rPr>
+          <w:rFonts w:ascii="Calibri" w:hAnsi="Calibri"/>
           <w:i/>
-          <w:color w:val="64746E"/>
-          <w:sz w:val="22"/>
+          <w:color w:val="5F6B60"/>
+          <w:sz w:val="18"/>
         </w:rPr>
-        <w:t>Formato imprimible para autorizar la publicación educativa de un caso, con datos anonimizados. Adáptalo a los requisitos legales de tu institución.</w:t>
+        <w:t>Autorización para publicar un caso de campo con fines educativos y de divulgación. Adáptalo a los requisitos legales de tu institución.</w:t>
       </w:r>
     </w:p>
     <w:p>
       <w:pPr>
         <w:pStyle w:val="Heading1"/>
+        <w:spacing w:before="160"/>
       </w:pPr>
       <w:r>
-        <w:t>Datos del caso</w:t>
+        <w:t>1. Datos del caso y del productor</w:t>
       </w:r>
     </w:p>
     <w:tbl>
       <w:tblPr>
-        <w:tblStyle w:val="TableGrid"/>
         <w:tblW w:type="auto" w:w="0"/>
         <w:jc w:val="center"/>
+        <w:tblBorders>
+          <w:top w:val="single" w:sz="4" w:space="0" w:color="C8D2C0"/>
+          <w:left w:val="single" w:sz="4" w:space="0" w:color="C8D2C0"/>
+          <w:bottom w:val="single" w:sz="4" w:space="0" w:color="C8D2C0"/>
+          <w:right w:val="single" w:sz="4" w:space="0" w:color="C8D2C0"/>
+          <w:insideH w:val="single" w:sz="4" w:space="0" w:color="C8D2C0"/>
+          <w:insideV w:val="single" w:sz="4" w:space="0" w:color="C8D2C0"/>
+        </w:tblBorders>
+        <w:tblLayout w:type="fixed"/>
+        <w:tblCellMar>
+          <w:top w:w="30" w:type="dxa"/>
+          <w:bottom w:w="30" w:type="dxa"/>
+          <w:left w:w="80" w:type="dxa"/>
+          <w:right w:w="80" w:type="dxa"/>
+        </w:tblCellMar>
         <w:tblLook w:firstColumn="1" w:firstRow="1" w:lastColumn="0" w:lastRow="0" w:noHBand="0" w:noVBand="1" w:val="04A0"/>
       </w:tblPr>
       <w:tblGrid>
-        <w:gridCol w:w="4873"/>
-        <w:gridCol w:w="4873"/>
+        <w:gridCol w:w="2098"/>
+        <w:gridCol w:w="2608"/>
+        <w:gridCol w:w="2154"/>
+        <w:gridCol w:w="2551"/>
       </w:tblGrid>
       <w:tr>
+        <w:trPr>
+          <w:cantSplit/>
+          <w:trHeight w:val="351" w:hRule="atLeast"/>
+        </w:trPr>
         <w:tc>
           <w:tcPr>
-            <w:tcW w:type="dxa" w:w="4873"/>
-            <w:shd w:val="clear" w:color="auto" w:fill="F7F3EA"/>
+            <w:tcW w:type="dxa" w:w="2098"/>
+            <w:vAlign w:val="center"/>
+            <w:shd w:val="clear" w:color="auto" w:fill="E8EDE4"/>
           </w:tcPr>
           <w:p>
             <w:pPr>
-              <w:spacing w:after="40" w:before="40"/>
+              <w:spacing w:before="20" w:after="20" w:line="240" w:lineRule="auto"/>
             </w:pPr>
             <w:r/>
             <w:r>
               <w:rPr>
+                <w:rFonts w:ascii="Calibri" w:hAnsi="Calibri"/>
                 <w:b/>
+                <w:i w:val="0"/>
+                <w:color w:val="1F3D2B"/>
+                <w:sz w:val="17"/>
               </w:rPr>
-              <w:t>Título propuesto del caso</w:t>
+              <w:t>Título del caso</w:t>
             </w:r>
           </w:p>
         </w:tc>
         <w:tc>
           <w:tcPr>
-            <w:tcW w:type="dxa" w:w="4873"/>
+            <w:tcW w:type="dxa" w:w="2608"/>
+            <w:vAlign w:val="center"/>
           </w:tcPr>
           <w:p>
             <w:pPr>
-              <w:spacing w:after="40" w:before="40"/>
+              <w:spacing w:before="20" w:after="20" w:line="240" w:lineRule="auto"/>
             </w:pPr>
             <w:r/>
             <w:r>
               <w:rPr>
+                <w:rFonts w:ascii="Calibri" w:hAnsi="Calibri"/>
                 <w:b w:val="0"/>
+                <w:i w:val="0"/>
+                <w:sz w:val="18"/>
+              </w:rPr>
+            </w:r>
+          </w:p>
+        </w:tc>
+        <w:tc>
+          <w:tcPr>
+            <w:tcW w:type="dxa" w:w="2154"/>
+            <w:vAlign w:val="center"/>
+            <w:shd w:val="clear" w:color="auto" w:fill="E8EDE4"/>
+          </w:tcPr>
+          <w:p>
+            <w:pPr>
+              <w:spacing w:before="20" w:after="20" w:line="240" w:lineRule="auto"/>
+            </w:pPr>
+            <w:r/>
+            <w:r>
+              <w:rPr>
+                <w:rFonts w:ascii="Calibri" w:hAnsi="Calibri"/>
+                <w:b/>
+                <w:i w:val="0"/>
+                <w:color w:val="1F3D2B"/>
+                <w:sz w:val="17"/>
+              </w:rPr>
+              <w:t>Cultivo y variedad</w:t>
+            </w:r>
+          </w:p>
+        </w:tc>
+        <w:tc>
+          <w:tcPr>
+            <w:tcW w:type="dxa" w:w="2551"/>
+            <w:vAlign w:val="center"/>
+          </w:tcPr>
+          <w:p>
+            <w:pPr>
+              <w:spacing w:before="20" w:after="20" w:line="240" w:lineRule="auto"/>
+            </w:pPr>
+            <w:r/>
+            <w:r>
+              <w:rPr>
+                <w:rFonts w:ascii="Calibri" w:hAnsi="Calibri"/>
+                <w:b w:val="0"/>
+                <w:i w:val="0"/>
+                <w:sz w:val="18"/>
               </w:rPr>
             </w:r>
           </w:p>
         </w:tc>
       </w:tr>
       <w:tr>
+        <w:trPr>
+          <w:cantSplit/>
+          <w:trHeight w:val="351" w:hRule="atLeast"/>
+        </w:trPr>
         <w:tc>
           <w:tcPr>
-            <w:tcW w:type="dxa" w:w="4873"/>
-            <w:shd w:val="clear" w:color="auto" w:fill="F7F3EA"/>
+            <w:tcW w:type="dxa" w:w="2098"/>
+            <w:vAlign w:val="center"/>
+            <w:shd w:val="clear" w:color="auto" w:fill="E8EDE4"/>
           </w:tcPr>
           <w:p>
             <w:pPr>
-              <w:spacing w:after="40" w:before="40"/>
+              <w:spacing w:before="20" w:after="20" w:line="240" w:lineRule="auto"/>
             </w:pPr>
             <w:r/>
             <w:r>
               <w:rPr>
+                <w:rFonts w:ascii="Calibri" w:hAnsi="Calibri"/>
                 <w:b/>
+                <w:i w:val="0"/>
+                <w:color w:val="1F3D2B"/>
+                <w:sz w:val="17"/>
               </w:rPr>
-              <w:t>Especie / raza</w:t>
+              <w:t>Municipio y estado</w:t>
             </w:r>
           </w:p>
         </w:tc>
         <w:tc>
           <w:tcPr>
-            <w:tcW w:type="dxa" w:w="4873"/>
+            <w:tcW w:type="dxa" w:w="2608"/>
+            <w:vAlign w:val="center"/>
           </w:tcPr>
           <w:p>
             <w:pPr>
-              <w:spacing w:after="40" w:before="40"/>
+              <w:spacing w:before="20" w:after="20" w:line="240" w:lineRule="auto"/>
             </w:pPr>
             <w:r/>
             <w:r>
               <w:rPr>
+                <w:rFonts w:ascii="Calibri" w:hAnsi="Calibri"/>
                 <w:b w:val="0"/>
+                <w:i w:val="0"/>
+                <w:sz w:val="18"/>
+              </w:rPr>
+            </w:r>
+          </w:p>
+        </w:tc>
+        <w:tc>
+          <w:tcPr>
+            <w:tcW w:type="dxa" w:w="2154"/>
+            <w:vAlign w:val="center"/>
+            <w:shd w:val="clear" w:color="auto" w:fill="E8EDE4"/>
+          </w:tcPr>
+          <w:p>
+            <w:pPr>
+              <w:spacing w:before="20" w:after="20" w:line="240" w:lineRule="auto"/>
+            </w:pPr>
+            <w:r/>
+            <w:r>
+              <w:rPr>
+                <w:rFonts w:ascii="Calibri" w:hAnsi="Calibri"/>
+                <w:b/>
+                <w:i w:val="0"/>
+                <w:color w:val="1F3D2B"/>
+                <w:sz w:val="17"/>
+              </w:rPr>
+              <w:t>Superficie (ha)</w:t>
+            </w:r>
+          </w:p>
+        </w:tc>
+        <w:tc>
+          <w:tcPr>
+            <w:tcW w:type="dxa" w:w="2551"/>
+            <w:vAlign w:val="center"/>
+          </w:tcPr>
+          <w:p>
+            <w:pPr>
+              <w:spacing w:before="20" w:after="20" w:line="240" w:lineRule="auto"/>
+            </w:pPr>
+            <w:r/>
+            <w:r>
+              <w:rPr>
+                <w:rFonts w:ascii="Calibri" w:hAnsi="Calibri"/>
+                <w:b w:val="0"/>
+                <w:i w:val="0"/>
+                <w:sz w:val="18"/>
               </w:rPr>
             </w:r>
           </w:p>
         </w:tc>
       </w:tr>
       <w:tr>
+        <w:trPr>
+          <w:cantSplit/>
+          <w:trHeight w:val="351" w:hRule="atLeast"/>
+        </w:trPr>
         <w:tc>
           <w:tcPr>
-            <w:tcW w:type="dxa" w:w="4873"/>
-            <w:shd w:val="clear" w:color="auto" w:fill="F7F3EA"/>
+            <w:tcW w:type="dxa" w:w="2098"/>
+            <w:vAlign w:val="center"/>
+            <w:shd w:val="clear" w:color="auto" w:fill="E8EDE4"/>
           </w:tcPr>
           <w:p>
             <w:pPr>
-              <w:spacing w:after="40" w:before="40"/>
+              <w:spacing w:before="20" w:after="20" w:line="240" w:lineRule="auto"/>
             </w:pPr>
             <w:r/>
             <w:r>
               <w:rPr>
+                <w:rFonts w:ascii="Calibri" w:hAnsi="Calibri"/>
                 <w:b/>
+                <w:i w:val="0"/>
+                <w:color w:val="1F3D2B"/>
+                <w:sz w:val="17"/>
               </w:rPr>
-              <w:t>Nombre del tutor</w:t>
+              <w:t>Nombre del productor</w:t>
             </w:r>
           </w:p>
         </w:tc>
         <w:tc>
           <w:tcPr>
-            <w:tcW w:type="dxa" w:w="4873"/>
+            <w:tcW w:type="dxa" w:w="2608"/>
+            <w:vAlign w:val="center"/>
           </w:tcPr>
           <w:p>
             <w:pPr>
-              <w:spacing w:after="40" w:before="40"/>
+              <w:spacing w:before="20" w:after="20" w:line="240" w:lineRule="auto"/>
             </w:pPr>
             <w:r/>
             <w:r>
               <w:rPr>
+                <w:rFonts w:ascii="Calibri" w:hAnsi="Calibri"/>
                 <w:b w:val="0"/>
+                <w:i w:val="0"/>
+                <w:sz w:val="18"/>
+              </w:rPr>
+            </w:r>
+          </w:p>
+        </w:tc>
+        <w:tc>
+          <w:tcPr>
+            <w:tcW w:type="dxa" w:w="2154"/>
+            <w:vAlign w:val="center"/>
+            <w:shd w:val="clear" w:color="auto" w:fill="E8EDE4"/>
+          </w:tcPr>
+          <w:p>
+            <w:pPr>
+              <w:spacing w:before="20" w:after="20" w:line="240" w:lineRule="auto"/>
+            </w:pPr>
+            <w:r/>
+            <w:r>
+              <w:rPr>
+                <w:rFonts w:ascii="Calibri" w:hAnsi="Calibri"/>
+                <w:b/>
+                <w:i w:val="0"/>
+                <w:color w:val="1F3D2B"/>
+                <w:sz w:val="17"/>
+              </w:rPr>
+              <w:t>Calidad</w:t>
+            </w:r>
+          </w:p>
+        </w:tc>
+        <w:tc>
+          <w:tcPr>
+            <w:tcW w:type="dxa" w:w="2551"/>
+            <w:vAlign w:val="center"/>
+          </w:tcPr>
+          <w:p>
+            <w:pPr>
+              <w:spacing w:before="20" w:after="20" w:line="240" w:lineRule="auto"/>
+            </w:pPr>
+            <w:r/>
+            <w:r>
+              <w:rPr>
+                <w:rFonts w:ascii="Calibri" w:hAnsi="Calibri"/>
+                <w:b w:val="0"/>
+                <w:i w:val="0"/>
+                <w:sz w:val="18"/>
+              </w:rPr>
+              <w:t>Propietario / Ejidatario / Arrendatario</w:t>
+            </w:r>
+          </w:p>
+        </w:tc>
+      </w:tr>
+      <w:tr>
+        <w:trPr>
+          <w:cantSplit/>
+          <w:trHeight w:val="351" w:hRule="atLeast"/>
+        </w:trPr>
+        <w:tc>
+          <w:tcPr>
+            <w:tcW w:type="dxa" w:w="2098"/>
+            <w:vAlign w:val="center"/>
+            <w:shd w:val="clear" w:color="auto" w:fill="E8EDE4"/>
+          </w:tcPr>
+          <w:p>
+            <w:pPr>
+              <w:spacing w:before="20" w:after="20" w:line="240" w:lineRule="auto"/>
+            </w:pPr>
+            <w:r/>
+            <w:r>
+              <w:rPr>
+                <w:rFonts w:ascii="Calibri" w:hAnsi="Calibri"/>
+                <w:b/>
+                <w:i w:val="0"/>
+                <w:color w:val="1F3D2B"/>
+                <w:sz w:val="17"/>
+              </w:rPr>
+              <w:t>Ingeniero responsable</w:t>
+            </w:r>
+          </w:p>
+        </w:tc>
+        <w:tc>
+          <w:tcPr>
+            <w:tcW w:type="dxa" w:w="2608"/>
+            <w:vAlign w:val="center"/>
+          </w:tcPr>
+          <w:p>
+            <w:pPr>
+              <w:spacing w:before="20" w:after="20" w:line="240" w:lineRule="auto"/>
+            </w:pPr>
+            <w:r/>
+            <w:r>
+              <w:rPr>
+                <w:rFonts w:ascii="Calibri" w:hAnsi="Calibri"/>
+                <w:b w:val="0"/>
+                <w:i w:val="0"/>
+                <w:sz w:val="18"/>
+              </w:rPr>
+            </w:r>
+          </w:p>
+        </w:tc>
+        <w:tc>
+          <w:tcPr>
+            <w:tcW w:type="dxa" w:w="2154"/>
+            <w:vAlign w:val="center"/>
+            <w:shd w:val="clear" w:color="auto" w:fill="E8EDE4"/>
+          </w:tcPr>
+          <w:p>
+            <w:pPr>
+              <w:spacing w:before="20" w:after="20" w:line="240" w:lineRule="auto"/>
+            </w:pPr>
+            <w:r/>
+            <w:r>
+              <w:rPr>
+                <w:rFonts w:ascii="Calibri" w:hAnsi="Calibri"/>
+                <w:b/>
+                <w:i w:val="0"/>
+                <w:color w:val="1F3D2B"/>
+                <w:sz w:val="17"/>
+              </w:rPr>
+              <w:t>Cédula profesional</w:t>
+            </w:r>
+          </w:p>
+        </w:tc>
+        <w:tc>
+          <w:tcPr>
+            <w:tcW w:type="dxa" w:w="2551"/>
+            <w:vAlign w:val="center"/>
+          </w:tcPr>
+          <w:p>
+            <w:pPr>
+              <w:spacing w:before="20" w:after="20" w:line="240" w:lineRule="auto"/>
+            </w:pPr>
+            <w:r/>
+            <w:r>
+              <w:rPr>
+                <w:rFonts w:ascii="Calibri" w:hAnsi="Calibri"/>
+                <w:b w:val="0"/>
+                <w:i w:val="0"/>
+                <w:sz w:val="18"/>
               </w:rPr>
             </w:r>
           </w:p>
         </w:tc>
       </w:tr>
       <w:tr>
+        <w:trPr>
+          <w:cantSplit/>
+          <w:trHeight w:val="351" w:hRule="atLeast"/>
+        </w:trPr>
         <w:tc>
           <w:tcPr>
-            <w:tcW w:type="dxa" w:w="4873"/>
-            <w:shd w:val="clear" w:color="auto" w:fill="F7F3EA"/>
+            <w:tcW w:type="dxa" w:w="2098"/>
+            <w:vAlign w:val="center"/>
+            <w:shd w:val="clear" w:color="auto" w:fill="E8EDE4"/>
           </w:tcPr>
           <w:p>
             <w:pPr>
-              <w:spacing w:after="40" w:before="40"/>
+              <w:spacing w:before="20" w:after="20" w:line="240" w:lineRule="auto"/>
             </w:pPr>
             <w:r/>
             <w:r>
               <w:rPr>
+                <w:rFonts w:ascii="Calibri" w:hAnsi="Calibri"/>
                 <w:b/>
+                <w:i w:val="0"/>
+                <w:color w:val="1F3D2B"/>
+                <w:sz w:val="17"/>
               </w:rPr>
-              <w:t>Nombre del paciente</w:t>
+              <w:t>Institución o despacho</w:t>
             </w:r>
           </w:p>
         </w:tc>
         <w:tc>
           <w:tcPr>
-            <w:tcW w:type="dxa" w:w="4873"/>
+            <w:tcW w:type="dxa" w:w="2608"/>
+            <w:vAlign w:val="center"/>
           </w:tcPr>
           <w:p>
             <w:pPr>
-              <w:spacing w:after="40" w:before="40"/>
+              <w:spacing w:before="20" w:after="20" w:line="240" w:lineRule="auto"/>
             </w:pPr>
             <w:r/>
             <w:r>
               <w:rPr>
+                <w:rFonts w:ascii="Calibri" w:hAnsi="Calibri"/>
                 <w:b w:val="0"/>
+                <w:i w:val="0"/>
+                <w:sz w:val="18"/>
               </w:rPr>
-            </w:r>
-          </w:p>
-        </w:tc>
-      </w:tr>
-      <w:tr>
-        <w:tc>
-          <w:tcPr>
-            <w:tcW w:type="dxa" w:w="4873"/>
-            <w:shd w:val="clear" w:color="auto" w:fill="F7F3EA"/>
-          </w:tcPr>
-          <w:p>
-            <w:pPr>
-              <w:spacing w:after="40" w:before="40"/>
-            </w:pPr>
-            <w:r/>
-            <w:r>
-              <w:rPr>
-                <w:b/>
-              </w:rPr>
-              <w:t>Médico veterinario responsable</w:t>
             </w:r>
           </w:p>
         </w:tc>
         <w:tc>
           <w:tcPr>
-            <w:tcW w:type="dxa" w:w="4873"/>
+            <w:tcW w:type="dxa" w:w="2154"/>
+            <w:vAlign w:val="center"/>
+            <w:shd w:val="clear" w:color="auto" w:fill="E8EDE4"/>
           </w:tcPr>
           <w:p>
             <w:pPr>
-              <w:spacing w:after="40" w:before="40"/>
+              <w:spacing w:before="20" w:after="20" w:line="240" w:lineRule="auto"/>
             </w:pPr>
             <w:r/>
             <w:r>
               <w:rPr>
-                <w:b w:val="0"/>
-              </w:rPr>
-            </w:r>
-          </w:p>
-        </w:tc>
-      </w:tr>
-      <w:tr>
-        <w:tc>
-          <w:tcPr>
-            <w:tcW w:type="dxa" w:w="4873"/>
-            <w:shd w:val="clear" w:color="auto" w:fill="F7F3EA"/>
-          </w:tcPr>
-          <w:p>
-            <w:pPr>
-              <w:spacing w:after="40" w:before="40"/>
-            </w:pPr>
-            <w:r/>
-            <w:r>
-              <w:rPr>
+                <w:rFonts w:ascii="Calibri" w:hAnsi="Calibri"/>
                 <w:b/>
-              </w:rPr>
-              <w:t>Institución</w:t>
-            </w:r>
-          </w:p>
-        </w:tc>
-        <w:tc>
-          <w:tcPr>
-            <w:tcW w:type="dxa" w:w="4873"/>
-          </w:tcPr>
-          <w:p>
-            <w:pPr>
-              <w:spacing w:after="40" w:before="40"/>
-            </w:pPr>
-            <w:r/>
-            <w:r>
-              <w:rPr>
-                <w:b w:val="0"/>
-              </w:rPr>
-            </w:r>
-          </w:p>
-        </w:tc>
-      </w:tr>
-      <w:tr>
-        <w:tc>
-          <w:tcPr>
-            <w:tcW w:type="dxa" w:w="4873"/>
-            <w:shd w:val="clear" w:color="auto" w:fill="F7F3EA"/>
-          </w:tcPr>
-          <w:p>
-            <w:pPr>
-              <w:spacing w:after="40" w:before="40"/>
-            </w:pPr>
-            <w:r/>
-            <w:r>
-              <w:rPr>
-                <w:b/>
+                <w:i w:val="0"/>
+                <w:color w:val="1F3D2B"/>
+                <w:sz w:val="17"/>
               </w:rPr>
               <w:t>Fecha</w:t>
             </w:r>
@@ -279,59 +521,92 @@
         </w:tc>
         <w:tc>
           <w:tcPr>
-            <w:tcW w:type="dxa" w:w="4873"/>
+            <w:tcW w:type="dxa" w:w="2551"/>
+            <w:vAlign w:val="center"/>
           </w:tcPr>
           <w:p>
             <w:pPr>
-              <w:spacing w:after="40" w:before="40"/>
+              <w:spacing w:before="20" w:after="20" w:line="240" w:lineRule="auto"/>
             </w:pPr>
             <w:r/>
             <w:r>
               <w:rPr>
+                <w:rFonts w:ascii="Calibri" w:hAnsi="Calibri"/>
                 <w:b w:val="0"/>
+                <w:i w:val="0"/>
+                <w:sz w:val="18"/>
               </w:rPr>
             </w:r>
           </w:p>
         </w:tc>
       </w:tr>
     </w:tbl>
-    <w:p/>
     <w:p>
       <w:pPr>
         <w:pStyle w:val="Heading1"/>
+        <w:spacing w:before="160"/>
       </w:pPr>
       <w:r>
-        <w:t>Autorización</w:t>
+        <w:t>2. Declaración y autorización</w:t>
       </w:r>
     </w:p>
     <w:p>
       <w:r>
-        <w:t>Autorizo la publicación del caso clínico descrito, con fines educativos y de divulgación científica, en el portal Diagnóstico Veterinario y en materiales relacionados.</w:t>
+        <w:rPr>
+          <w:rFonts w:ascii="Calibri" w:hAnsi="Calibri"/>
+          <w:sz w:val="18"/>
+        </w:rPr>
+        <w:t>Declaro que recibí una explicación clara sobre el caso que se documentará, que mi participación es voluntaria y que no recibiré pago por autorizar su publicación. Autorizo el uso del texto, los datos técnicos y las imágenes descritas en el anexo, con las condiciones siguientes:</w:t>
       </w:r>
     </w:p>
     <w:tbl>
       <w:tblPr>
-        <w:tblStyle w:val="TableGrid"/>
         <w:tblW w:type="auto" w:w="0"/>
+        <w:jc w:val="center"/>
+        <w:tblBorders>
+          <w:top w:val="single" w:sz="4" w:space="0" w:color="C8D2C0"/>
+          <w:left w:val="single" w:sz="4" w:space="0" w:color="C8D2C0"/>
+          <w:bottom w:val="single" w:sz="4" w:space="0" w:color="C8D2C0"/>
+          <w:right w:val="single" w:sz="4" w:space="0" w:color="C8D2C0"/>
+          <w:insideH w:val="single" w:sz="4" w:space="0" w:color="C8D2C0"/>
+          <w:insideV w:val="single" w:sz="4" w:space="0" w:color="C8D2C0"/>
+        </w:tblBorders>
+        <w:tblLayout w:type="fixed"/>
+        <w:tblCellMar>
+          <w:top w:w="30" w:type="dxa"/>
+          <w:bottom w:w="30" w:type="dxa"/>
+          <w:left w:w="80" w:type="dxa"/>
+          <w:right w:w="80" w:type="dxa"/>
+        </w:tblCellMar>
         <w:tblLook w:firstColumn="1" w:firstRow="1" w:lastColumn="0" w:lastRow="0" w:noHBand="0" w:noVBand="1" w:val="04A0"/>
       </w:tblPr>
       <w:tblGrid>
-        <w:gridCol w:w="4873"/>
-        <w:gridCol w:w="4873"/>
+        <w:gridCol w:w="482"/>
+        <w:gridCol w:w="8929"/>
       </w:tblGrid>
       <w:tr>
+        <w:trPr>
+          <w:cantSplit/>
+          <w:trHeight w:val="283" w:hRule="atLeast"/>
+        </w:trPr>
         <w:tc>
           <w:tcPr>
-            <w:tcW w:type="dxa" w:w="567"/>
+            <w:tcW w:type="dxa" w:w="482"/>
+            <w:vAlign w:val="center"/>
           </w:tcPr>
           <w:p>
             <w:pPr>
-              <w:spacing w:after="40" w:before="40"/>
+              <w:spacing w:before="20" w:after="20" w:line="240" w:lineRule="auto"/>
+              <w:jc w:val="center"/>
             </w:pPr>
             <w:r/>
             <w:r>
               <w:rPr>
+                <w:rFonts w:ascii="Calibri" w:hAnsi="Calibri"/>
                 <w:b/>
+                <w:i w:val="0"/>
+                <w:color w:val="1F3D2B"/>
+                <w:sz w:val="22"/>
               </w:rPr>
               <w:t>☐</w:t>
             </w:r>
@@ -339,35 +614,49 @@
         </w:tc>
         <w:tc>
           <w:tcPr>
-            <w:tcW w:type="dxa" w:w="4873"/>
+            <w:tcW w:type="dxa" w:w="8929"/>
+            <w:vAlign w:val="center"/>
           </w:tcPr>
           <w:p>
             <w:pPr>
-              <w:spacing w:after="40" w:before="40"/>
+              <w:spacing w:before="20" w:after="20" w:line="240" w:lineRule="auto"/>
             </w:pPr>
             <w:r/>
             <w:r>
               <w:rPr>
+                <w:rFonts w:ascii="Calibri" w:hAnsi="Calibri"/>
                 <w:b w:val="0"/>
+                <w:i w:val="0"/>
+                <w:sz w:val="17"/>
               </w:rPr>
-              <w:t>Entiendo que el caso será público y podrá ser consultado y citado por otras personas.</w:t>
+              <w:t>Entiendo que el caso se publicará en AgroDiagnóstico y podrá ser leído y citado por otras personas.</w:t>
             </w:r>
           </w:p>
         </w:tc>
       </w:tr>
       <w:tr>
+        <w:trPr>
+          <w:cantSplit/>
+          <w:trHeight w:val="283" w:hRule="atLeast"/>
+        </w:trPr>
         <w:tc>
           <w:tcPr>
-            <w:tcW w:type="dxa" w:w="567"/>
+            <w:tcW w:type="dxa" w:w="482"/>
+            <w:vAlign w:val="center"/>
           </w:tcPr>
           <w:p>
             <w:pPr>
-              <w:spacing w:after="40" w:before="40"/>
+              <w:spacing w:before="20" w:after="20" w:line="240" w:lineRule="auto"/>
+              <w:jc w:val="center"/>
             </w:pPr>
             <w:r/>
             <w:r>
               <w:rPr>
+                <w:rFonts w:ascii="Calibri" w:hAnsi="Calibri"/>
                 <w:b/>
+                <w:i w:val="0"/>
+                <w:color w:val="1F3D2B"/>
+                <w:sz w:val="22"/>
               </w:rPr>
               <w:t>☐</w:t>
             </w:r>
@@ -375,35 +664,49 @@
         </w:tc>
         <w:tc>
           <w:tcPr>
-            <w:tcW w:type="dxa" w:w="4873"/>
+            <w:tcW w:type="dxa" w:w="8929"/>
+            <w:vAlign w:val="center"/>
           </w:tcPr>
           <w:p>
             <w:pPr>
-              <w:spacing w:after="40" w:before="40"/>
+              <w:spacing w:before="20" w:after="20" w:line="240" w:lineRule="auto"/>
             </w:pPr>
             <w:r/>
             <w:r>
               <w:rPr>
+                <w:rFonts w:ascii="Calibri" w:hAnsi="Calibri"/>
                 <w:b w:val="0"/>
+                <w:i w:val="0"/>
+                <w:sz w:val="17"/>
               </w:rPr>
-              <w:t>Autorizo el uso de texto clínico, imágenes y estudios que se adjunten, con datos anonimizados.</w:t>
+              <w:t>Autorizo que se publiquen datos del cultivo, municipio, superficie y manejo, sin mi nombre ni mis datos de contacto.</w:t>
             </w:r>
           </w:p>
         </w:tc>
       </w:tr>
       <w:tr>
+        <w:trPr>
+          <w:cantSplit/>
+          <w:trHeight w:val="283" w:hRule="atLeast"/>
+        </w:trPr>
         <w:tc>
           <w:tcPr>
-            <w:tcW w:type="dxa" w:w="567"/>
+            <w:tcW w:type="dxa" w:w="482"/>
+            <w:vAlign w:val="center"/>
           </w:tcPr>
           <w:p>
             <w:pPr>
-              <w:spacing w:after="40" w:before="40"/>
+              <w:spacing w:before="20" w:after="20" w:line="240" w:lineRule="auto"/>
+              <w:jc w:val="center"/>
             </w:pPr>
             <w:r/>
             <w:r>
               <w:rPr>
+                <w:rFonts w:ascii="Calibri" w:hAnsi="Calibri"/>
                 <w:b/>
+                <w:i w:val="0"/>
+                <w:color w:val="1F3D2B"/>
+                <w:sz w:val="22"/>
               </w:rPr>
               <w:t>☐</w:t>
             </w:r>
@@ -411,35 +714,49 @@
         </w:tc>
         <w:tc>
           <w:tcPr>
-            <w:tcW w:type="dxa" w:w="4873"/>
+            <w:tcW w:type="dxa" w:w="8929"/>
+            <w:vAlign w:val="center"/>
           </w:tcPr>
           <w:p>
             <w:pPr>
-              <w:spacing w:after="40" w:before="40"/>
+              <w:spacing w:before="20" w:after="20" w:line="240" w:lineRule="auto"/>
             </w:pPr>
             <w:r/>
             <w:r>
               <w:rPr>
+                <w:rFonts w:ascii="Calibri" w:hAnsi="Calibri"/>
                 <w:b w:val="0"/>
+                <w:i w:val="0"/>
+                <w:sz w:val="17"/>
               </w:rPr>
-              <w:t>Entiendo que no se publicarán mi nombre, dirección, teléfono, correo ni datos que permitan identificarme.</w:t>
+              <w:t>Entiendo que se eliminarán mi nombre, teléfono, correo, domicilio y las coordenadas exactas del predio.</w:t>
             </w:r>
           </w:p>
         </w:tc>
       </w:tr>
       <w:tr>
+        <w:trPr>
+          <w:cantSplit/>
+          <w:trHeight w:val="283" w:hRule="atLeast"/>
+        </w:trPr>
         <w:tc>
           <w:tcPr>
-            <w:tcW w:type="dxa" w:w="567"/>
+            <w:tcW w:type="dxa" w:w="482"/>
+            <w:vAlign w:val="center"/>
           </w:tcPr>
           <w:p>
             <w:pPr>
-              <w:spacing w:after="40" w:before="40"/>
+              <w:spacing w:before="20" w:after="20" w:line="240" w:lineRule="auto"/>
+              <w:jc w:val="center"/>
             </w:pPr>
             <w:r/>
             <w:r>
               <w:rPr>
+                <w:rFonts w:ascii="Calibri" w:hAnsi="Calibri"/>
                 <w:b/>
+                <w:i w:val="0"/>
+                <w:color w:val="1F3D2B"/>
+                <w:sz w:val="22"/>
               </w:rPr>
               <w:t>☐</w:t>
             </w:r>
@@ -447,35 +764,49 @@
         </w:tc>
         <w:tc>
           <w:tcPr>
-            <w:tcW w:type="dxa" w:w="4873"/>
+            <w:tcW w:type="dxa" w:w="8929"/>
+            <w:vAlign w:val="center"/>
           </w:tcPr>
           <w:p>
             <w:pPr>
-              <w:spacing w:after="40" w:before="40"/>
+              <w:spacing w:before="20" w:after="20" w:line="240" w:lineRule="auto"/>
             </w:pPr>
             <w:r/>
             <w:r>
               <w:rPr>
+                <w:rFonts w:ascii="Calibri" w:hAnsi="Calibri"/>
                 <w:b w:val="0"/>
+                <w:i w:val="0"/>
+                <w:sz w:val="17"/>
               </w:rPr>
-              <w:t>Entiendo que no se publicarán datos que permitan identificar a mi animal, como microchip o señas particulares.</w:t>
+              <w:t>Entiendo que las imágenes se revisarán para no mostrar personas, documentos, placas ni letreros con nombre.</w:t>
             </w:r>
           </w:p>
         </w:tc>
       </w:tr>
       <w:tr>
+        <w:trPr>
+          <w:cantSplit/>
+          <w:trHeight w:val="283" w:hRule="atLeast"/>
+        </w:trPr>
         <w:tc>
           <w:tcPr>
-            <w:tcW w:type="dxa" w:w="567"/>
+            <w:tcW w:type="dxa" w:w="482"/>
+            <w:vAlign w:val="center"/>
           </w:tcPr>
           <w:p>
             <w:pPr>
-              <w:spacing w:after="40" w:before="40"/>
+              <w:spacing w:before="20" w:after="20" w:line="240" w:lineRule="auto"/>
+              <w:jc w:val="center"/>
             </w:pPr>
             <w:r/>
             <w:r>
               <w:rPr>
+                <w:rFonts w:ascii="Calibri" w:hAnsi="Calibri"/>
                 <w:b/>
+                <w:i w:val="0"/>
+                <w:color w:val="1F3D2B"/>
+                <w:sz w:val="22"/>
               </w:rPr>
               <w:t>☐</w:t>
             </w:r>
@@ -483,35 +814,49 @@
         </w:tc>
         <w:tc>
           <w:tcPr>
-            <w:tcW w:type="dxa" w:w="4873"/>
+            <w:tcW w:type="dxa" w:w="8929"/>
+            <w:vAlign w:val="center"/>
           </w:tcPr>
           <w:p>
             <w:pPr>
-              <w:spacing w:after="40" w:before="40"/>
+              <w:spacing w:before="20" w:after="20" w:line="240" w:lineRule="auto"/>
             </w:pPr>
             <w:r/>
             <w:r>
               <w:rPr>
+                <w:rFonts w:ascii="Calibri" w:hAnsi="Calibri"/>
                 <w:b w:val="0"/>
+                <w:i w:val="0"/>
+                <w:sz w:val="17"/>
               </w:rPr>
-              <w:t>Autorizo que el caso se distribuya bajo una licencia de uso educativo con atribución (por defecto CC BY-NC-SA 4.0).</w:t>
+              <w:t>Autorizo la distribución del caso bajo la licencia CC BY-NC-SA 4.0, con atribución al autor y sin uso comercial.</w:t>
             </w:r>
           </w:p>
         </w:tc>
       </w:tr>
       <w:tr>
+        <w:trPr>
+          <w:cantSplit/>
+          <w:trHeight w:val="283" w:hRule="atLeast"/>
+        </w:trPr>
         <w:tc>
           <w:tcPr>
-            <w:tcW w:type="dxa" w:w="567"/>
+            <w:tcW w:type="dxa" w:w="482"/>
+            <w:vAlign w:val="center"/>
           </w:tcPr>
           <w:p>
             <w:pPr>
-              <w:spacing w:after="40" w:before="40"/>
+              <w:spacing w:before="20" w:after="20" w:line="240" w:lineRule="auto"/>
+              <w:jc w:val="center"/>
             </w:pPr>
             <w:r/>
             <w:r>
               <w:rPr>
+                <w:rFonts w:ascii="Calibri" w:hAnsi="Calibri"/>
                 <w:b/>
+                <w:i w:val="0"/>
+                <w:color w:val="1F3D2B"/>
+                <w:sz w:val="22"/>
               </w:rPr>
               <w:t>☐</w:t>
             </w:r>
@@ -519,35 +864,49 @@
         </w:tc>
         <w:tc>
           <w:tcPr>
-            <w:tcW w:type="dxa" w:w="4873"/>
+            <w:tcW w:type="dxa" w:w="8929"/>
+            <w:vAlign w:val="center"/>
           </w:tcPr>
           <w:p>
             <w:pPr>
-              <w:spacing w:after="40" w:before="40"/>
+              <w:spacing w:before="20" w:after="20" w:line="240" w:lineRule="auto"/>
             </w:pPr>
             <w:r/>
             <w:r>
               <w:rPr>
+                <w:rFonts w:ascii="Calibri" w:hAnsi="Calibri"/>
                 <w:b w:val="0"/>
+                <w:i w:val="0"/>
+                <w:sz w:val="17"/>
               </w:rPr>
-              <w:t>Entiendo que puedo solicitar correcciones o el retiro del contenido escribiendo al comité editorial.</w:t>
+              <w:t>Sé que puedo solicitar correcciones o el retiro del contenido escribiendo al comité editorial del portal.</w:t>
             </w:r>
           </w:p>
         </w:tc>
       </w:tr>
       <w:tr>
+        <w:trPr>
+          <w:cantSplit/>
+          <w:trHeight w:val="283" w:hRule="atLeast"/>
+        </w:trPr>
         <w:tc>
           <w:tcPr>
-            <w:tcW w:type="dxa" w:w="567"/>
+            <w:tcW w:type="dxa" w:w="482"/>
+            <w:vAlign w:val="center"/>
           </w:tcPr>
           <w:p>
             <w:pPr>
-              <w:spacing w:after="40" w:before="40"/>
+              <w:spacing w:before="20" w:after="20" w:line="240" w:lineRule="auto"/>
+              <w:jc w:val="center"/>
             </w:pPr>
             <w:r/>
             <w:r>
               <w:rPr>
+                <w:rFonts w:ascii="Calibri" w:hAnsi="Calibri"/>
                 <w:b/>
+                <w:i w:val="0"/>
+                <w:color w:val="1F3D2B"/>
+                <w:sz w:val="22"/>
               </w:rPr>
               <w:t>☐</w:t>
             </w:r>
@@ -555,424 +914,604 @@
         </w:tc>
         <w:tc>
           <w:tcPr>
-            <w:tcW w:type="dxa" w:w="4873"/>
+            <w:tcW w:type="dxa" w:w="8929"/>
+            <w:vAlign w:val="center"/>
           </w:tcPr>
           <w:p>
             <w:pPr>
-              <w:spacing w:after="40" w:before="40"/>
+              <w:spacing w:before="20" w:after="20" w:line="240" w:lineRule="auto"/>
             </w:pPr>
             <w:r/>
             <w:r>
               <w:rPr>
+                <w:rFonts w:ascii="Calibri" w:hAnsi="Calibri"/>
                 <w:b w:val="0"/>
+                <w:i w:val="0"/>
+                <w:sz w:val="17"/>
               </w:rPr>
-              <w:t>Entiendo que la publicación no implica un diagnóstico para otros pacientes ni una recomendación de tratamiento universal.</w:t>
+              <w:t>Entiendo que la publicación no sustituye una recomendación técnica para mi parcela ni garantiza resultados.</w:t>
+            </w:r>
+          </w:p>
+        </w:tc>
+      </w:tr>
+      <w:tr>
+        <w:trPr>
+          <w:cantSplit/>
+          <w:trHeight w:val="283" w:hRule="atLeast"/>
+        </w:trPr>
+        <w:tc>
+          <w:tcPr>
+            <w:tcW w:type="dxa" w:w="482"/>
+            <w:vAlign w:val="center"/>
+          </w:tcPr>
+          <w:p>
+            <w:pPr>
+              <w:spacing w:before="20" w:after="20" w:line="240" w:lineRule="auto"/>
+              <w:jc w:val="center"/>
+            </w:pPr>
+            <w:r/>
+            <w:r>
+              <w:rPr>
+                <w:rFonts w:ascii="Calibri" w:hAnsi="Calibri"/>
+                <w:b/>
+                <w:i w:val="0"/>
+                <w:color w:val="1F3D2B"/>
+                <w:sz w:val="22"/>
+              </w:rPr>
+              <w:t>☐</w:t>
+            </w:r>
+          </w:p>
+        </w:tc>
+        <w:tc>
+          <w:tcPr>
+            <w:tcW w:type="dxa" w:w="8929"/>
+            <w:vAlign w:val="center"/>
+          </w:tcPr>
+          <w:p>
+            <w:pPr>
+              <w:spacing w:before="20" w:after="20" w:line="240" w:lineRule="auto"/>
+            </w:pPr>
+            <w:r/>
+            <w:r>
+              <w:rPr>
+                <w:rFonts w:ascii="Calibri" w:hAnsi="Calibri"/>
+                <w:b w:val="0"/>
+                <w:i w:val="0"/>
+                <w:sz w:val="17"/>
+              </w:rPr>
+              <w:t>Declaro que la información que proporcioné es veraz y que puedo autorizar el uso de las imágenes adjuntas.</w:t>
             </w:r>
           </w:p>
         </w:tc>
       </w:tr>
     </w:tbl>
-    <w:p/>
     <w:p>
       <w:pPr>
         <w:pStyle w:val="Heading1"/>
+        <w:spacing w:before="160"/>
       </w:pPr>
       <w:r>
-        <w:t>Limitaciones y riesgos</w:t>
+        <w:t>3. Límites y riesgos</w:t>
       </w:r>
     </w:p>
     <w:p>
       <w:r>
-        <w:t>La publicación es voluntaria y no afecta la atención recibida. Aunque se eliminan datos identificables, existe un riesgo residual de reconocimiento por combinación de detalles clínicos. El equipo editorial revisará el contenido antes de publicarlo y puede solicitar cambios o rechazarlo.</w:t>
+        <w:rPr>
+          <w:rFonts w:ascii="Calibri" w:hAnsi="Calibri"/>
+          <w:sz w:val="17"/>
+        </w:rPr>
+        <w:t>La publicación es voluntaria y no afecta la atención técnica que recibo. Aunque se eliminan los datos identificables, existe un riesgo residual de reconocimiento por la combinación de cultivo, municipio, variedad y fecha. El equipo editorial revisará el contenido antes de publicarlo y puede solicitar cambios o rechazarlo. No se publicará información comercial sensible, adeudos, apoyos gubernamentales ni detalles de tenencia de la tierra.</w:t>
       </w:r>
     </w:p>
     <w:p>
       <w:pPr>
         <w:pStyle w:val="Heading1"/>
+        <w:spacing w:before="160"/>
       </w:pPr>
       <w:r>
-        <w:t>Declaración del médico</w:t>
-      </w:r>
-    </w:p>
-    <w:p>
-      <w:r>
-        <w:t>Confirmo que expliqué al tutor el alcance de la publicación, que cuento con la autorización correspondiente y que el caso se documentó de forma veraz. Me comprometo a eliminar datos identificables y a no incluir publicidad encubierta.</w:t>
+        <w:t>4. Anexo: imágenes y archivos autorizados</w:t>
       </w:r>
     </w:p>
     <w:tbl>
       <w:tblPr>
-        <w:tblStyle w:val="TableGrid"/>
         <w:tblW w:type="auto" w:w="0"/>
         <w:jc w:val="center"/>
+        <w:tblBorders>
+          <w:top w:val="single" w:sz="4" w:space="0" w:color="C8D2C0"/>
+          <w:left w:val="single" w:sz="4" w:space="0" w:color="C8D2C0"/>
+          <w:bottom w:val="single" w:sz="4" w:space="0" w:color="C8D2C0"/>
+          <w:right w:val="single" w:sz="4" w:space="0" w:color="C8D2C0"/>
+          <w:insideH w:val="single" w:sz="4" w:space="0" w:color="C8D2C0"/>
+          <w:insideV w:val="single" w:sz="4" w:space="0" w:color="C8D2C0"/>
+        </w:tblBorders>
+        <w:tblLayout w:type="fixed"/>
+        <w:tblCellMar>
+          <w:top w:w="30" w:type="dxa"/>
+          <w:bottom w:w="30" w:type="dxa"/>
+          <w:left w:w="80" w:type="dxa"/>
+          <w:right w:w="80" w:type="dxa"/>
+        </w:tblCellMar>
         <w:tblLook w:firstColumn="1" w:firstRow="1" w:lastColumn="0" w:lastRow="0" w:noHBand="0" w:noVBand="1" w:val="04A0"/>
       </w:tblPr>
       <w:tblGrid>
-        <w:gridCol w:w="4873"/>
-        <w:gridCol w:w="4873"/>
+        <w:gridCol w:w="2948"/>
+        <w:gridCol w:w="3288"/>
+        <w:gridCol w:w="1814"/>
+        <w:gridCol w:w="1361"/>
       </w:tblGrid>
       <w:tr>
+        <w:trPr>
+          <w:cantSplit/>
+          <w:tblHeader/>
+        </w:trPr>
         <w:tc>
           <w:tcPr>
-            <w:tcW w:type="dxa" w:w="4873"/>
-            <w:shd w:val="clear" w:color="auto" w:fill="F7F3EA"/>
+            <w:tcW w:type="dxa" w:w="2948"/>
+            <w:shd w:val="clear" w:color="auto" w:fill="4F6F52"/>
+            <w:vAlign w:val="center"/>
           </w:tcPr>
           <w:p>
             <w:pPr>
-              <w:spacing w:after="40" w:before="40"/>
+              <w:spacing w:before="20" w:after="20" w:line="240" w:lineRule="auto"/>
+              <w:jc w:val="center"/>
             </w:pPr>
             <w:r/>
             <w:r>
               <w:rPr>
+                <w:rFonts w:ascii="Calibri" w:hAnsi="Calibri"/>
                 <w:b/>
+                <w:i w:val="0"/>
+                <w:color w:val="FFFFFF"/>
+                <w:sz w:val="15"/>
               </w:rPr>
-              <w:t>Nombre del médico</w:t>
+              <w:t>Archivo o imagen</w:t>
             </w:r>
           </w:p>
         </w:tc>
         <w:tc>
           <w:tcPr>
-            <w:tcW w:type="dxa" w:w="4873"/>
+            <w:tcW w:type="dxa" w:w="3288"/>
+            <w:shd w:val="clear" w:color="auto" w:fill="4F6F52"/>
+            <w:vAlign w:val="center"/>
           </w:tcPr>
           <w:p>
             <w:pPr>
-              <w:spacing w:after="40" w:before="40"/>
+              <w:spacing w:before="20" w:after="20" w:line="240" w:lineRule="auto"/>
+              <w:jc w:val="center"/>
             </w:pPr>
             <w:r/>
             <w:r>
               <w:rPr>
-                <w:b w:val="0"/>
+                <w:rFonts w:ascii="Calibri" w:hAnsi="Calibri"/>
+                <w:b/>
+                <w:i w:val="0"/>
+                <w:color w:val="FFFFFF"/>
+                <w:sz w:val="15"/>
               </w:rPr>
+              <w:t>Descripción</w:t>
+            </w:r>
+          </w:p>
+        </w:tc>
+        <w:tc>
+          <w:tcPr>
+            <w:tcW w:type="dxa" w:w="1814"/>
+            <w:shd w:val="clear" w:color="auto" w:fill="4F6F52"/>
+            <w:vAlign w:val="center"/>
+          </w:tcPr>
+          <w:p>
+            <w:pPr>
+              <w:spacing w:before="20" w:after="20" w:line="240" w:lineRule="auto"/>
+              <w:jc w:val="center"/>
+            </w:pPr>
+            <w:r/>
+            <w:r>
+              <w:rPr>
+                <w:rFonts w:ascii="Calibri" w:hAnsi="Calibri"/>
+                <w:b/>
+                <w:i w:val="0"/>
+                <w:color w:val="FFFFFF"/>
+                <w:sz w:val="15"/>
+              </w:rPr>
+              <w:t>¿Se difumina algo?</w:t>
+            </w:r>
+          </w:p>
+        </w:tc>
+        <w:tc>
+          <w:tcPr>
+            <w:tcW w:type="dxa" w:w="1361"/>
+            <w:shd w:val="clear" w:color="auto" w:fill="4F6F52"/>
+            <w:vAlign w:val="center"/>
+          </w:tcPr>
+          <w:p>
+            <w:pPr>
+              <w:spacing w:before="20" w:after="20" w:line="240" w:lineRule="auto"/>
+              <w:jc w:val="center"/>
+            </w:pPr>
+            <w:r/>
+            <w:r>
+              <w:rPr>
+                <w:rFonts w:ascii="Calibri" w:hAnsi="Calibri"/>
+                <w:b/>
+                <w:i w:val="0"/>
+                <w:color w:val="FFFFFF"/>
+                <w:sz w:val="15"/>
+              </w:rPr>
+              <w:t>Autorizado</w:t>
             </w:r>
           </w:p>
         </w:tc>
       </w:tr>
       <w:tr>
+        <w:trPr>
+          <w:cantSplit/>
+          <w:trHeight w:val="454" w:hRule="atLeast"/>
+        </w:trPr>
         <w:tc>
           <w:tcPr>
-            <w:tcW w:type="dxa" w:w="4873"/>
-            <w:shd w:val="clear" w:color="auto" w:fill="F7F3EA"/>
+            <w:tcW w:type="dxa" w:w="2948"/>
+            <w:vAlign w:val="center"/>
           </w:tcPr>
           <w:p>
             <w:pPr>
-              <w:spacing w:after="40" w:before="40"/>
+              <w:spacing w:before="20" w:after="20" w:line="240" w:lineRule="auto"/>
             </w:pPr>
             <w:r/>
             <w:r>
               <w:rPr>
-                <w:b/>
+                <w:rFonts w:ascii="Calibri" w:hAnsi="Calibri"/>
+                <w:b w:val="0"/>
+                <w:i/>
+                <w:color w:val="5F6B60"/>
+                <w:sz w:val="15"/>
               </w:rPr>
-              <w:t>Cédula profesional</w:t>
+              <w:t>Ej. foto_01.jpg</w:t>
             </w:r>
           </w:p>
         </w:tc>
         <w:tc>
           <w:tcPr>
-            <w:tcW w:type="dxa" w:w="4873"/>
+            <w:tcW w:type="dxa" w:w="3288"/>
+            <w:vAlign w:val="center"/>
           </w:tcPr>
           <w:p>
             <w:pPr>
-              <w:spacing w:after="40" w:before="40"/>
+              <w:spacing w:before="20" w:after="20" w:line="240" w:lineRule="auto"/>
             </w:pPr>
             <w:r/>
             <w:r>
               <w:rPr>
+                <w:rFonts w:ascii="Calibri" w:hAnsi="Calibri"/>
                 <w:b w:val="0"/>
+                <w:i/>
+                <w:color w:val="5F6B60"/>
+                <w:sz w:val="15"/>
               </w:rPr>
+              <w:t>Síntomas en hoja</w:t>
+            </w:r>
+          </w:p>
+        </w:tc>
+        <w:tc>
+          <w:tcPr>
+            <w:tcW w:type="dxa" w:w="1814"/>
+            <w:vAlign w:val="center"/>
+          </w:tcPr>
+          <w:p>
+            <w:pPr>
+              <w:spacing w:before="20" w:after="20" w:line="240" w:lineRule="auto"/>
+            </w:pPr>
+            <w:r/>
+            <w:r>
+              <w:rPr>
+                <w:rFonts w:ascii="Calibri" w:hAnsi="Calibri"/>
+                <w:b w:val="0"/>
+                <w:i/>
+                <w:color w:val="5F6B60"/>
+                <w:sz w:val="15"/>
+              </w:rPr>
+              <w:t>No</w:t>
+            </w:r>
+          </w:p>
+        </w:tc>
+        <w:tc>
+          <w:tcPr>
+            <w:tcW w:type="dxa" w:w="1361"/>
+            <w:vAlign w:val="center"/>
+          </w:tcPr>
+          <w:p>
+            <w:pPr>
+              <w:spacing w:before="20" w:after="20" w:line="240" w:lineRule="auto"/>
+            </w:pPr>
+            <w:r/>
+            <w:r>
+              <w:rPr>
+                <w:rFonts w:ascii="Calibri" w:hAnsi="Calibri"/>
+                <w:b w:val="0"/>
+                <w:i/>
+                <w:color w:val="5F6B60"/>
+                <w:sz w:val="15"/>
+              </w:rPr>
+              <w:t>Sí</w:t>
             </w:r>
           </w:p>
         </w:tc>
       </w:tr>
       <w:tr>
+        <w:trPr>
+          <w:cantSplit/>
+          <w:trHeight w:val="454" w:hRule="atLeast"/>
+        </w:trPr>
         <w:tc>
           <w:tcPr>
-            <w:tcW w:type="dxa" w:w="4873"/>
-            <w:shd w:val="clear" w:color="auto" w:fill="F7F3EA"/>
+            <w:tcW w:type="dxa" w:w="2948"/>
+            <w:vAlign w:val="center"/>
+          </w:tcPr>
+          <w:p/>
+        </w:tc>
+        <w:tc>
+          <w:tcPr>
+            <w:tcW w:type="dxa" w:w="3288"/>
+            <w:vAlign w:val="center"/>
+          </w:tcPr>
+          <w:p/>
+        </w:tc>
+        <w:tc>
+          <w:tcPr>
+            <w:tcW w:type="dxa" w:w="1814"/>
+            <w:vAlign w:val="center"/>
+          </w:tcPr>
+          <w:p/>
+        </w:tc>
+        <w:tc>
+          <w:tcPr>
+            <w:tcW w:type="dxa" w:w="1361"/>
+            <w:vAlign w:val="center"/>
+          </w:tcPr>
+          <w:p/>
+        </w:tc>
+      </w:tr>
+      <w:tr>
+        <w:trPr>
+          <w:cantSplit/>
+          <w:trHeight w:val="454" w:hRule="atLeast"/>
+        </w:trPr>
+        <w:tc>
+          <w:tcPr>
+            <w:tcW w:type="dxa" w:w="2948"/>
+            <w:vAlign w:val="center"/>
+          </w:tcPr>
+          <w:p/>
+        </w:tc>
+        <w:tc>
+          <w:tcPr>
+            <w:tcW w:type="dxa" w:w="3288"/>
+            <w:vAlign w:val="center"/>
+          </w:tcPr>
+          <w:p/>
+        </w:tc>
+        <w:tc>
+          <w:tcPr>
+            <w:tcW w:type="dxa" w:w="1814"/>
+            <w:vAlign w:val="center"/>
+          </w:tcPr>
+          <w:p/>
+        </w:tc>
+        <w:tc>
+          <w:tcPr>
+            <w:tcW w:type="dxa" w:w="1361"/>
+            <w:vAlign w:val="center"/>
+          </w:tcPr>
+          <w:p/>
+        </w:tc>
+      </w:tr>
+    </w:tbl>
+    <w:p>
+      <w:pPr>
+        <w:pStyle w:val="Heading1"/>
+        <w:spacing w:before="160"/>
+      </w:pPr>
+      <w:r>
+        <w:t>5. Declaración del ingeniero agrónomo</w:t>
+      </w:r>
+    </w:p>
+    <w:p>
+      <w:r>
+        <w:rPr>
+          <w:rFonts w:ascii="Calibri" w:hAnsi="Calibri"/>
+          <w:sz w:val="17"/>
+        </w:rPr>
+        <w:t>Confirmo que expliqué al productor el alcance de la publicación, que cuento con su autorización y que el caso se documentó de forma veraz. Me comprometo a eliminar datos identificables, a no incluir publicidad encubierta y a resguardar el consentimiento firmado.</w:t>
+      </w:r>
+    </w:p>
+    <w:p>
+      <w:pPr>
+        <w:pStyle w:val="Heading1"/>
+        <w:spacing w:before="160"/>
+      </w:pPr>
+      <w:r>
+        <w:t>6. Firmas</w:t>
+      </w:r>
+    </w:p>
+    <w:tbl>
+      <w:tblPr>
+        <w:tblW w:type="auto" w:w="0"/>
+        <w:jc w:val="center"/>
+        <w:tblBorders>
+          <w:top w:val="single" w:sz="4" w:space="0" w:color="C8D2C0"/>
+          <w:left w:val="single" w:sz="4" w:space="0" w:color="C8D2C0"/>
+          <w:bottom w:val="single" w:sz="4" w:space="0" w:color="C8D2C0"/>
+          <w:right w:val="single" w:sz="4" w:space="0" w:color="C8D2C0"/>
+          <w:insideH w:val="single" w:sz="4" w:space="0" w:color="C8D2C0"/>
+          <w:insideV w:val="single" w:sz="4" w:space="0" w:color="C8D2C0"/>
+        </w:tblBorders>
+        <w:tblLayout w:type="fixed"/>
+        <w:tblCellMar>
+          <w:top w:w="30" w:type="dxa"/>
+          <w:bottom w:w="30" w:type="dxa"/>
+          <w:left w:w="80" w:type="dxa"/>
+          <w:right w:w="80" w:type="dxa"/>
+        </w:tblCellMar>
+        <w:tblLook w:firstColumn="1" w:firstRow="1" w:lastColumn="0" w:lastRow="0" w:noHBand="0" w:noVBand="1" w:val="04A0"/>
+      </w:tblPr>
+      <w:tblGrid>
+        <w:gridCol w:w="4706"/>
+        <w:gridCol w:w="4706"/>
+      </w:tblGrid>
+      <w:tr>
+        <w:trPr>
+          <w:cantSplit/>
+          <w:trHeight w:val="1928" w:hRule="atLeast"/>
+        </w:trPr>
+        <w:tc>
+          <w:tcPr>
+            <w:tcW w:type="dxa" w:w="4706"/>
+            <w:vAlign w:val="top"/>
           </w:tcPr>
           <w:p>
             <w:pPr>
-              <w:spacing w:after="40" w:before="40"/>
+              <w:spacing w:after="80"/>
+              <w:jc w:val="center"/>
             </w:pPr>
-            <w:r/>
             <w:r>
               <w:rPr>
+                <w:rFonts w:ascii="Calibri" w:hAnsi="Calibri"/>
                 <w:b/>
+                <w:color w:val="1F3D2B"/>
+                <w:sz w:val="17"/>
               </w:rPr>
-              <w:t>Firma</w:t>
+              <w:t>Productor o representante legal</w:t>
+            </w:r>
+          </w:p>
+          <w:p/>
+          <w:p/>
+          <w:p>
+            <w:pPr>
+              <w:pBdr>
+                <w:bottom w:val="single" w:sz="6" w:space="2" w:color="4F6F52"/>
+              </w:pBdr>
+              <w:spacing w:after="40"/>
+            </w:pPr>
+          </w:p>
+          <w:p>
+            <w:pPr>
+              <w:spacing w:after="0"/>
+              <w:jc w:val="center"/>
+            </w:pPr>
+            <w:r>
+              <w:rPr>
+                <w:rFonts w:ascii="Calibri" w:hAnsi="Calibri"/>
+                <w:color w:val="5F6B60"/>
+                <w:sz w:val="15"/>
+              </w:rPr>
+              <w:t>Nombre y firma</w:t>
+            </w:r>
+          </w:p>
+          <w:p>
+            <w:pPr>
+              <w:spacing w:after="0"/>
+              <w:jc w:val="center"/>
+            </w:pPr>
+            <w:r>
+              <w:rPr>
+                <w:rFonts w:ascii="Calibri" w:hAnsi="Calibri"/>
+                <w:color w:val="5F6B60"/>
+                <w:sz w:val="15"/>
+              </w:rPr>
+              <w:t>Fecha: ____ / ____ / ________</w:t>
             </w:r>
           </w:p>
         </w:tc>
         <w:tc>
           <w:tcPr>
-            <w:tcW w:type="dxa" w:w="4873"/>
+            <w:tcW w:type="dxa" w:w="4706"/>
+            <w:vAlign w:val="top"/>
           </w:tcPr>
           <w:p>
             <w:pPr>
-              <w:spacing w:after="40" w:before="40"/>
+              <w:spacing w:after="80"/>
+              <w:jc w:val="center"/>
             </w:pPr>
-            <w:r/>
             <w:r>
               <w:rPr>
-                <w:b w:val="0"/>
+                <w:rFonts w:ascii="Calibri" w:hAnsi="Calibri"/>
+                <w:b/>
+                <w:color w:val="1F3D2B"/>
+                <w:sz w:val="17"/>
               </w:rPr>
+              <w:t>Ingeniero agrónomo responsable</w:t>
             </w:r>
           </w:p>
-        </w:tc>
-      </w:tr>
-      <w:tr>
-        <w:tc>
-          <w:tcPr>
-            <w:tcW w:type="dxa" w:w="4873"/>
-            <w:shd w:val="clear" w:color="auto" w:fill="F7F3EA"/>
-          </w:tcPr>
+          <w:p/>
+          <w:p/>
           <w:p>
             <w:pPr>
-              <w:spacing w:after="40" w:before="40"/>
+              <w:pBdr>
+                <w:bottom w:val="single" w:sz="6" w:space="2" w:color="4F6F52"/>
+              </w:pBdr>
+              <w:spacing w:after="40"/>
             </w:pPr>
-            <w:r/>
+          </w:p>
+          <w:p>
+            <w:pPr>
+              <w:spacing w:after="0"/>
+              <w:jc w:val="center"/>
+            </w:pPr>
             <w:r>
               <w:rPr>
-                <w:b/>
+                <w:rFonts w:ascii="Calibri" w:hAnsi="Calibri"/>
+                <w:color w:val="5F6B60"/>
+                <w:sz w:val="15"/>
               </w:rPr>
-              <w:t>Fecha</w:t>
+              <w:t>Nombre y firma</w:t>
             </w:r>
           </w:p>
-        </w:tc>
-        <w:tc>
-          <w:tcPr>
-            <w:tcW w:type="dxa" w:w="4873"/>
-          </w:tcPr>
           <w:p>
             <w:pPr>
-              <w:spacing w:after="40" w:before="40"/>
+              <w:spacing w:after="0"/>
+              <w:jc w:val="center"/>
             </w:pPr>
-            <w:r/>
             <w:r>
               <w:rPr>
-                <w:b w:val="0"/>
+                <w:rFonts w:ascii="Calibri" w:hAnsi="Calibri"/>
+                <w:color w:val="5F6B60"/>
+                <w:sz w:val="15"/>
               </w:rPr>
+              <w:t>Cédula profesional: ______________</w:t>
             </w:r>
           </w:p>
         </w:tc>
       </w:tr>
     </w:tbl>
-    <w:p/>
     <w:p>
       <w:pPr>
-        <w:pStyle w:val="Heading1"/>
+        <w:spacing w:before="120"/>
       </w:pPr>
       <w:r>
-        <w:t>Firma del tutor</w:t>
+        <w:rPr>
+          <w:rFonts w:ascii="Calibri" w:hAnsi="Calibri"/>
+          <w:sz w:val="16"/>
+        </w:rPr>
+        <w:t>Testigo (opcional): ______________________________________    Firma: ______________________________</w:t>
       </w:r>
     </w:p>
-    <w:tbl>
-      <w:tblPr>
-        <w:tblStyle w:val="TableGrid"/>
-        <w:tblW w:type="auto" w:w="0"/>
-        <w:jc w:val="center"/>
-        <w:tblLook w:firstColumn="1" w:firstRow="1" w:lastColumn="0" w:lastRow="0" w:noHBand="0" w:noVBand="1" w:val="04A0"/>
-      </w:tblPr>
-      <w:tblGrid>
-        <w:gridCol w:w="4873"/>
-        <w:gridCol w:w="4873"/>
-      </w:tblGrid>
-      <w:tr>
-        <w:tc>
-          <w:tcPr>
-            <w:tcW w:type="dxa" w:w="4873"/>
-            <w:shd w:val="clear" w:color="auto" w:fill="F7F3EA"/>
-          </w:tcPr>
-          <w:p>
-            <w:pPr>
-              <w:spacing w:after="40" w:before="40"/>
-            </w:pPr>
-            <w:r/>
-            <w:r>
-              <w:rPr>
-                <w:b/>
-              </w:rPr>
-              <w:t>Nombre completo</w:t>
-            </w:r>
-          </w:p>
-        </w:tc>
-        <w:tc>
-          <w:tcPr>
-            <w:tcW w:type="dxa" w:w="4873"/>
-          </w:tcPr>
-          <w:p>
-            <w:pPr>
-              <w:spacing w:after="40" w:before="40"/>
-            </w:pPr>
-            <w:r/>
-            <w:r>
-              <w:rPr>
-                <w:b w:val="0"/>
-              </w:rPr>
-            </w:r>
-          </w:p>
-        </w:tc>
-      </w:tr>
-      <w:tr>
-        <w:tc>
-          <w:tcPr>
-            <w:tcW w:type="dxa" w:w="4873"/>
-            <w:shd w:val="clear" w:color="auto" w:fill="F7F3EA"/>
-          </w:tcPr>
-          <w:p>
-            <w:pPr>
-              <w:spacing w:after="40" w:before="40"/>
-            </w:pPr>
-            <w:r/>
-            <w:r>
-              <w:rPr>
-                <w:b/>
-              </w:rPr>
-              <w:t>Parentesco o calidad</w:t>
-            </w:r>
-          </w:p>
-        </w:tc>
-        <w:tc>
-          <w:tcPr>
-            <w:tcW w:type="dxa" w:w="4873"/>
-          </w:tcPr>
-          <w:p>
-            <w:pPr>
-              <w:spacing w:after="40" w:before="40"/>
-            </w:pPr>
-            <w:r/>
-            <w:r>
-              <w:rPr>
-                <w:b w:val="0"/>
-              </w:rPr>
-              <w:t>Tutor / Representante legal</w:t>
-            </w:r>
-          </w:p>
-        </w:tc>
-      </w:tr>
-      <w:tr>
-        <w:tc>
-          <w:tcPr>
-            <w:tcW w:type="dxa" w:w="4873"/>
-            <w:shd w:val="clear" w:color="auto" w:fill="F7F3EA"/>
-          </w:tcPr>
-          <w:p>
-            <w:pPr>
-              <w:spacing w:after="40" w:before="40"/>
-            </w:pPr>
-            <w:r/>
-            <w:r>
-              <w:rPr>
-                <w:b/>
-              </w:rPr>
-              <w:t>Firma</w:t>
-            </w:r>
-          </w:p>
-        </w:tc>
-        <w:tc>
-          <w:tcPr>
-            <w:tcW w:type="dxa" w:w="4873"/>
-          </w:tcPr>
-          <w:p>
-            <w:pPr>
-              <w:spacing w:after="40" w:before="40"/>
-            </w:pPr>
-            <w:r/>
-            <w:r>
-              <w:rPr>
-                <w:b w:val="0"/>
-              </w:rPr>
-            </w:r>
-          </w:p>
-        </w:tc>
-      </w:tr>
-      <w:tr>
-        <w:tc>
-          <w:tcPr>
-            <w:tcW w:type="dxa" w:w="4873"/>
-            <w:shd w:val="clear" w:color="auto" w:fill="F7F3EA"/>
-          </w:tcPr>
-          <w:p>
-            <w:pPr>
-              <w:spacing w:after="40" w:before="40"/>
-            </w:pPr>
-            <w:r/>
-            <w:r>
-              <w:rPr>
-                <w:b/>
-              </w:rPr>
-              <w:t>Fecha</w:t>
-            </w:r>
-          </w:p>
-        </w:tc>
-        <w:tc>
-          <w:tcPr>
-            <w:tcW w:type="dxa" w:w="4873"/>
-          </w:tcPr>
-          <w:p>
-            <w:pPr>
-              <w:spacing w:after="40" w:before="40"/>
-            </w:pPr>
-            <w:r/>
-            <w:r>
-              <w:rPr>
-                <w:b w:val="0"/>
-              </w:rPr>
-            </w:r>
-          </w:p>
-        </w:tc>
-      </w:tr>
-      <w:tr>
-        <w:tc>
-          <w:tcPr>
-            <w:tcW w:type="dxa" w:w="4873"/>
-            <w:shd w:val="clear" w:color="auto" w:fill="F7F3EA"/>
-          </w:tcPr>
-          <w:p>
-            <w:pPr>
-              <w:spacing w:after="40" w:before="40"/>
-            </w:pPr>
-            <w:r/>
-            <w:r>
-              <w:rPr>
-                <w:b/>
-              </w:rPr>
-              <w:t>Testigo (opcional)</w:t>
-            </w:r>
-          </w:p>
-        </w:tc>
-        <w:tc>
-          <w:tcPr>
-            <w:tcW w:type="dxa" w:w="4873"/>
-          </w:tcPr>
-          <w:p>
-            <w:pPr>
-              <w:spacing w:after="40" w:before="40"/>
-            </w:pPr>
-            <w:r/>
-            <w:r>
-              <w:rPr>
-                <w:b w:val="0"/>
-              </w:rPr>
-            </w:r>
-          </w:p>
-        </w:tc>
-      </w:tr>
-    </w:tbl>
-    <w:p/>
     <w:p>
+      <w:pPr>
+        <w:spacing w:before="120"/>
+      </w:pPr>
       <w:r>
         <w:rPr>
+          <w:rFonts w:ascii="Calibri" w:hAnsi="Calibri"/>
           <w:i/>
-          <w:color w:val="64746E"/>
-          <w:sz w:val="18"/>
+          <w:color w:val="5F6B60"/>
+          <w:sz w:val="15"/>
         </w:rPr>
-        <w:t>Conserva una copia firmada en el expediente. Esta plantilla no constituye asesoría legal; verifica los requisitos de tu institución y la normativa aplicable.</w:t>
+        <w:t>Conserva una copia firmada en tu expediente y entrega otra al productor. Esta plantilla no constituye asesoría legal: verifica los requisitos de tu institución y la normativa aplicable en materia de datos personales.</w:t>
       </w:r>
     </w:p>
     <w:sectPr>
       <w:headerReference w:type="default" r:id="rId9"/>
       <w:footerReference w:type="default" r:id="rId10"/>
       <w:pgSz w:w="12240" w:h="15840"/>
-      <w:pgMar w:top="1134" w:right="1247" w:bottom="1134" w:left="1247" w:header="720" w:footer="720" w:gutter="0"/>
+      <w:pgMar w:top="1304" w:right="1247" w:bottom="1134" w:left="1247" w:header="567" w:footer="510" w:gutter="0"/>
       <w:cols w:space="720"/>
       <w:docGrid w:linePitch="360"/>
     </w:sectPr>
@@ -989,10 +1528,50 @@
     </w:pPr>
     <w:r>
       <w:rPr>
-        <w:color w:val="64746E"/>
-        <w:sz w:val="16"/>
-      </w:rPr>
-      <w:t>Documento educativo · No sustituye el juicio clínico ni la normativa aplicable.</w:t>
+        <w:rFonts w:ascii="Calibri" w:hAnsi="Calibri"/>
+        <w:color w:val="5F6B60"/>
+        <w:sz w:val="14"/>
+      </w:rPr>
+    </w:r>
+    <w:r>
+      <w:rPr>
+        <w:rFonts w:ascii="Calibri" w:hAnsi="Calibri"/>
+        <w:color w:val="5F6B60"/>
+        <w:sz w:val="14"/>
+      </w:rPr>
+      <w:t xml:space="preserve">Documento de apoyo · No sustituye el juicio profesional ni la normativa aplicable · Página </w:t>
+    </w:r>
+    <w:r>
+      <w:rPr>
+        <w:rFonts w:ascii="Calibri" w:hAnsi="Calibri"/>
+        <w:color w:val="5F6B60"/>
+        <w:sz w:val="14"/>
+      </w:rPr>
+      <w:fldChar w:fldCharType="begin"/>
+      <w:instrText xml:space="preserve"> PAGE </w:instrText>
+      <w:fldChar w:fldCharType="separate"/>
+      <w:t>1</w:t>
+      <w:fldChar w:fldCharType="end"/>
+    </w:r>
+    <w:r>
+      <w:rPr>
+        <w:rFonts w:ascii="Calibri" w:hAnsi="Calibri"/>
+        <w:color w:val="5F6B60"/>
+        <w:sz w:val="14"/>
+      </w:rPr>
+      <w:t xml:space="preserve"> de </w:t>
+    </w:r>
+    <w:r>
+      <w:rPr>
+        <w:rFonts w:ascii="Calibri" w:hAnsi="Calibri"/>
+        <w:color w:val="5F6B60"/>
+        <w:sz w:val="14"/>
+      </w:rPr>
+      <w:fldChar w:fldCharType="begin"/>
+      <w:instrText xml:space="preserve"> NUMPAGES </w:instrText>
+      <w:fldChar w:fldCharType="separate"/>
+      <w:t>1</w:t>
+      <w:fldChar w:fldCharType="end"/>
     </w:r>
   </w:p>
 </w:ftr>
@@ -1003,15 +1582,32 @@
   <w:p>
     <w:pPr>
       <w:pStyle w:val="Header"/>
+      <w:pBdr>
+        <w:bottom w:val="single" w:sz="4" w:space="2" w:color="4F6F52"/>
+      </w:pBdr>
+      <w:spacing w:after="0"/>
       <w:jc w:val="right"/>
     </w:pPr>
+    <w:r/>
     <w:r>
       <w:rPr>
-        <w:b/>
-        <w:color w:val="64746E"/>
-        <w:sz w:val="16"/>
-      </w:rPr>
-      <w:t>DIAGNÓSTICO VETERINARIO · KIT PARA VETERINARIOS</w:t>
+        <w:rFonts w:ascii="Calibri" w:hAnsi="Calibri"/>
+        <w:b/>
+        <w:color w:val="1F3D2B"/>
+        <w:spacing w:val="20"/>
+        <w:sz w:val="15"/>
+      </w:rPr>
+      <w:t>AGRODIAGNÓSTICO</w:t>
+    </w:r>
+    <w:r>
+      <w:rPr>
+        <w:rFonts w:ascii="Calibri" w:hAnsi="Calibri"/>
+        <w:b/>
+        <w:color w:val="4F6F52"/>
+        <w:spacing w:val="20"/>
+        <w:sz w:val="15"/>
+      </w:rPr>
+      <w:t xml:space="preserve"> · KIT PARA INGENIEROS AGRÓNOMOS</w:t>
     </w:r>
   </w:p>
 </w:hdr>
@@ -1381,12 +1977,12 @@
     <w:qFormat/>
     <w:rsid w:val="00FC693F"/>
     <w:pPr>
-      <w:spacing w:after="120" w:line="276" w:lineRule="auto"/>
+      <w:spacing w:after="80" w:before="0" w:line="254" w:lineRule="auto"/>
     </w:pPr>
     <w:rPr>
       <w:rFonts w:ascii="Calibri" w:hAnsi="Calibri"/>
-      <w:color w:val="12211D"/>
-      <w:sz w:val="22"/>
+      <w:color w:val="1B241E"/>
+      <w:sz w:val="19"/>
     </w:rPr>
   </w:style>
   <w:style w:type="paragraph" w:styleId="Header">
@@ -1444,15 +2040,15 @@
     <w:pPr>
       <w:keepNext/>
       <w:keepLines/>
-      <w:spacing w:before="280" w:after="120"/>
+      <w:spacing w:before="180" w:after="40"/>
       <w:outlineLvl w:val="0"/>
     </w:pPr>
     <w:rPr>
-      <w:rFonts w:asciiTheme="majorHAnsi" w:eastAsiaTheme="majorEastAsia" w:hAnsiTheme="majorHAnsi" w:cstheme="majorBidi" w:ascii="Calibri" w:hAnsi="Calibri"/>
+      <w:rFonts w:ascii="Calibri" w:hAnsi="Calibri"/>
       <w:b/>
       <w:bCs/>
-      <w:color w:val="0D5C4D"/>
-      <w:sz w:val="30"/>
+      <w:color w:val="1F3D2B"/>
+      <w:sz w:val="23"/>
       <w:szCs w:val="28"/>
     </w:rPr>
   </w:style>
@@ -1468,15 +2064,15 @@
     <w:pPr>
       <w:keepNext/>
       <w:keepLines/>
-      <w:spacing w:before="280" w:after="120"/>
+      <w:spacing w:before="40" w:after="40"/>
       <w:outlineLvl w:val="1"/>
     </w:pPr>
     <w:rPr>
-      <w:rFonts w:asciiTheme="majorHAnsi" w:eastAsiaTheme="majorEastAsia" w:hAnsiTheme="majorHAnsi" w:cstheme="majorBidi" w:ascii="Calibri" w:hAnsi="Calibri"/>
+      <w:rFonts w:ascii="Calibri" w:hAnsi="Calibri"/>
       <w:b/>
       <w:bCs/>
-      <w:color w:val="0D5C4D"/>
-      <w:sz w:val="24"/>
+      <w:color w:val="1F3D2B"/>
+      <w:sz w:val="21"/>
       <w:szCs w:val="26"/>
     </w:rPr>
   </w:style>
@@ -1730,19 +2326,20 @@
     <w:qFormat/>
     <w:rsid w:val="00FC693F"/>
     <w:pPr>
+      <w:keepNext/>
       <w:pBdr>
-        <w:bottom w:val="single" w:sz="8" w:space="4" w:color="4F81BD" w:themeColor="accent1"/>
+        <w:bottom w:val="single" w:sz="8" w:space="4" w:color="4F6F52"/>
       </w:pBdr>
-      <w:spacing w:after="120" w:line="240" w:lineRule="auto" w:before="280"/>
+      <w:spacing w:after="40" w:line="240" w:lineRule="auto" w:before="40"/>
       <w:contextualSpacing/>
     </w:pPr>
     <w:rPr>
-      <w:rFonts w:asciiTheme="majorHAnsi" w:eastAsiaTheme="majorEastAsia" w:hAnsiTheme="majorHAnsi" w:cstheme="majorBidi" w:ascii="Calibri" w:hAnsi="Calibri"/>
+      <w:rFonts w:ascii="Calibri" w:hAnsi="Calibri"/>
       <w:b/>
-      <w:color w:val="0D5C4D"/>
+      <w:color w:val="1F3D2B"/>
       <w:spacing w:val="5"/>
       <w:kern w:val="28"/>
-      <w:sz w:val="48"/>
+      <w:sz w:val="38"/>
       <w:szCs w:val="52"/>
     </w:rPr>
   </w:style>

</xml_diff>